<commit_message>
Bổ sung Luật 93/2025/QH15, sơ đồ và điều chỉnh nội dung 3 chương theo góp ý
Co-Authored-By: Claude Opus 5.5 <noreply@anthropic.com>
Claude-Session: https://claude.ai/code/session_01ThGArqDrUUsqC1zG1BQvVL
</commit_message>
<xml_diff>
--- a/Ban_cuoi/Chuong_1_Co_so_ly_luan_va_phap_ly.docx
+++ b/Ban_cuoi/Chuong_1_Co_so_ly_luan_va_phap_ly.docx
@@ -128,20 +128,20 @@
         <w:rPr>
           <w:szCs w:val="26"/>
         </w:rPr>
-        <w:t xml:space="preserve">Trong nền kinh tế tri thức và cuộc cách mạng công nghiệp lần thứ tư, tài sản trí tuệ được xác định là nguồn vốn vô hình chiến lược cốt lõi, quyết định trực tiếp năng lực sáng tạo, uy tín khoa học và sức cạnh tranh của mỗi cơ sở giáo dục đại học. Dưới góc độ chuẩn mực quốc tế, Tổ chức Sở hữu trí tuệ thế giới (năm 2020) định nghĩa tài sản trí tuệ bao gồm mọi kết quả sáng tạo của tư duy con người, từ các tác phẩm văn học nghệ thuật, bài giảng, giáo trình cho đến các sáng chế công nghệ, giải pháp kỹ thuật, kiểu dáng công nghiệp, nhãn hiệu và chương trình máy tính. Bổ sung cho góc nhìn này, Milliken và Allen (năm 2013) nhấn mạnh đây là các sản phẩm độc đáo sở hữu giá trị kinh tế tiềm năng và mang lại lợi thế cạnh tranh rõ nét cho chủ thể sở hữu.</w:t>
-      </w:r>
-    </w:p>
-    <w:p>
-      <w:pPr>
-        <w:rPr>
-          <w:szCs w:val="26"/>
-        </w:rPr>
-      </w:pPr>
-      <w:r>
-        <w:rPr>
-          <w:szCs w:val="26"/>
-        </w:rPr>
-        <w:t xml:space="preserve">Từ lăng kính lý luận học thuật, Fisher (năm 2001) và Guan (năm 2014) chỉ ra rằng tài sản trí tuệ là sự kết hợp hữu cơ giữa tính trí tuệ (sản phẩm kết tinh từ sự đầu tư lao động tư duy nghiêm túc) và tính tài sản (khả năng sinh lời kinh tế hoặc mang lại lợi ích pháp lý), được điều chỉnh và điều tiết bởi hệ thống các định chế pháp luật chuyên biệt. Để luận giải căn nguyên và bản chất pháp lý của việc bảo hộ tài sản trí tuệ, lý luận quốc tế xác lập bốn trường phái lý thuyết nền tảng:</w:t>
+        <w:t xml:space="preserve">Trong nền kinh tế tri thức và cuộc cách mạng công nghiệp lần thứ tư, tài sản trí tuệ được xác định là nguồn vốn vô hình chiến lược cốt lõi, quyết định trực tiếp năng lực sáng tạo, uy tín khoa học và sức cạnh tranh của mỗi cơ sở giáo dục đại học. Dưới góc độ chuẩn mực quốc tế, Tổ chức Sở hữu trí tuệ thế giới (2020) định nghĩa tài sản trí tuệ bao gồm mọi kết quả sáng tạo của tư duy con người, từ các tác phẩm văn học nghệ thuật, bài giảng, giáo trình cho đến các sáng chế công nghệ, giải pháp kỹ thuật, kiểu dáng công nghiệp, nhãn hiệu và chương trình máy tính. Bổ sung cho góc nhìn này, Milliken và Allen (2013) nhấn mạnh đây là các sản phẩm độc đáo sở hữu giá trị kinh tế tiềm năng và mang lại lợi thế cạnh tranh rõ nét cho chủ thể sở hữu.</w:t>
+      </w:r>
+    </w:p>
+    <w:p>
+      <w:pPr>
+        <w:rPr>
+          <w:szCs w:val="26"/>
+        </w:rPr>
+      </w:pPr>
+      <w:r>
+        <w:rPr>
+          <w:szCs w:val="26"/>
+        </w:rPr>
+        <w:t xml:space="preserve">Từ lăng kính lý luận học thuật, Fisher (2001) và Guan (2014) chỉ ra rằng tài sản trí tuệ là sự kết hợp hữu cơ giữa tính trí tuệ (sản phẩm kết tinh từ sự đầu tư lao động tư duy nghiêm túc) và tính tài sản (khả năng sinh lời kinh tế hoặc mang lại lợi ích pháp lý), được điều chỉnh và điều tiết bởi hệ thống các định chế pháp luật chuyên biệt. Để luận giải căn nguyên và bản chất pháp lý của việc bảo hộ tài sản trí tuệ, lý luận quốc tế xác lập bốn trường phái lý thuyết nền tảng:</w:t>
       </w:r>
     </w:p>
     <w:p>
@@ -193,20 +193,20 @@
         <w:rPr>
           <w:szCs w:val="26"/>
         </w:rPr>
-        <w:t xml:space="preserve">- Lý thuyết hoạch định xã hội: Vận dụng quyền sở hữu trí tuệ như một công cụ thể chế nhằm thúc đẩy một xã hội dân chủ, đa dạng văn hóa và nuôi dưỡng môi trường đổi mới sáng tạo bền vững (Fisher, năm 2001).</w:t>
-      </w:r>
-    </w:p>
-    <w:p>
-      <w:pPr>
-        <w:rPr>
-          <w:szCs w:val="26"/>
-        </w:rPr>
-      </w:pPr>
-      <w:r>
-        <w:rPr>
-          <w:szCs w:val="26"/>
-        </w:rPr>
-        <w:t xml:space="preserve">Đáng chú ý, Cục Sở hữu trí tuệ (năm 2020) đã phân nhánh rõ rệt khái niệm này: nếu đối với cơ quan quản lý và doanh nghiệp, tài sản trí tuệ gắn liền với đầu tư và thương mại, thì đối với các trường đại học và viện nghiên cứu, tài sản trí tuệ được khu biệt thành các kết quả học thuật cốt lõi như ý tưởng khoa học, công trình nghiên cứu, bài báo chuyên ngành, giáo trình, sáng chế công nghệ và phần mềm ứng dụng.</w:t>
+        <w:t xml:space="preserve">- Lý thuyết hoạch định xã hội: Vận dụng quyền sở hữu trí tuệ như một công cụ thể chế nhằm thúc đẩy một xã hội dân chủ, đa dạng văn hóa và nuôi dưỡng môi trường đổi mới sáng tạo bền vững (Fisher, 2001).</w:t>
+      </w:r>
+    </w:p>
+    <w:p>
+      <w:pPr>
+        <w:rPr>
+          <w:szCs w:val="26"/>
+        </w:rPr>
+      </w:pPr>
+      <w:r>
+        <w:rPr>
+          <w:szCs w:val="26"/>
+        </w:rPr>
+        <w:t xml:space="preserve">Đáng chú ý, tài liệu tập huấn của Cục Sở hữu trí tuệ (n.d.) dành cho cán bộ trường đại học, viện nghiên cứu đã phân nhánh rõ rệt khái niệm này: nếu đối với cơ quan quản lý và doanh nghiệp, tài sản trí tuệ gắn liền với đầu tư và thương mại, thì đối với các trường đại học và viện nghiên cứu, tài sản trí tuệ được khu biệt thành các kết quả học thuật cốt lõi như ý tưởng khoa học, công trình nghiên cứu, bài báo chuyên ngành, giáo trình, sáng chế công nghệ và phần mềm ứng dụng.</w:t>
       </w:r>
     </w:p>
     <w:p>
@@ -233,7 +233,7 @@
         <w:rPr>
           <w:szCs w:val="26"/>
         </w:rPr>
-        <w:t xml:space="preserve">Để xác lập cơ chế bảo hộ cho các khối tài sản vô hình đó, quyền sở hữu trí tuệ được thiết lập như một khung pháp lý chuyên biệt. Các điều ước quốc tế như Công ước Stockholm năm 1967 về thành lập Tổ chức Sở hữu trí tuệ thế giới hay Hiệp định về các khía cạnh liên quan tới thương mại của quyền sở hữu trí tuệ đều xác định quyền sở hữu trí tuệ là quyền độc quyền có thời hạn trao cho chủ thể sáng tạo nhằm khai thác, sử dụng, định đoạt và ngăn chặn hành vi sao chép trái phép. Tại Việt Nam, Điều 4 Luật Sở hữu trí tuệ quy định quyền sở hữu trí tuệ là quyền của tổ chức, cá nhân đối với tài sản trí tuệ, bao gồm quyền tác giả và quyền liên quan, quyền sở hữu công nghiệp và quyền đối với giống cây trồng (Văn phòng Quốc hội, năm 2026).</w:t>
+        <w:t xml:space="preserve">Để xác lập cơ chế bảo hộ cho các khối tài sản vô hình đó, quyền sở hữu trí tuệ được thiết lập như một khung pháp lý chuyên biệt. Các điều ước quốc tế như Công ước Stockholm năm 1967 về thành lập Tổ chức Sở hữu trí tuệ thế giới hay Hiệp định về các khía cạnh liên quan tới thương mại của quyền sở hữu trí tuệ đều xác định quyền sở hữu trí tuệ là quyền độc quyền có thời hạn trao cho chủ thể sáng tạo nhằm khai thác, sử dụng, định đoạt và ngăn chặn hành vi sao chép trái phép. Tại Việt Nam, Điều 4 Luật Sở hữu trí tuệ quy định quyền sở hữu trí tuệ là quyền của tổ chức, cá nhân đối với tài sản trí tuệ, bao gồm quyền tác giả và quyền liên quan, quyền sở hữu công nghiệp và quyền đối với giống cây trồng (Văn phòng Quốc hội, 2026).</w:t>
       </w:r>
     </w:p>
     <w:p>
@@ -312,20 +312,20 @@
         <w:rPr>
           <w:szCs w:val="26"/>
         </w:rPr>
-        <w:t xml:space="preserve">Quản lý quyền sở hữu trí tuệ trong cơ sở giáo dục đại học là hệ thống các hoạt động có chủ đích nhằm hoạch định chính sách thể chế, ban hành quy chế nội bộ, thiết lập bộ máy chuyên trách và vận hành các quy trình nghiệp vụ để điều tiết toàn bộ chu trình sống của tài sản trí tuệ, bao gồm toàn bộ tiến trình từ khâu hình thành ý tưởng nghiên cứu, thẩm định tính mới, bảo mật thông tin, đăng ký xác lập quyền bảo hộ, cho đến khai thác thương mại hóa, chuyển giao công nghệ và bảo vệ quyền sở hữu trí tuệ trước các hành vi xâm phạm (Bradley và cộng sự, năm 2013; Goldfarb và Henrekson, năm 2003).</w:t>
-      </w:r>
-    </w:p>
-    <w:p>
-      <w:pPr>
-        <w:rPr>
-          <w:szCs w:val="26"/>
-        </w:rPr>
-      </w:pPr>
-      <w:r>
-        <w:rPr>
-          <w:szCs w:val="26"/>
-        </w:rPr>
-        <w:t xml:space="preserve">Khác biệt căn bản với khu vực doanh nghiệp thương mại vốn ưu tiên mục tiêu duy nhất là tối đa hóa lợi nhuận tài chính và bảo vệ thị phần độc quyền (Teece, năm 2018), quản lý sở hữu trí tuệ trong trường đại học mang bản chất lưỡng dụng và đa mục tiêu phức tạp (Nguyễn Minh Huyền Trang, năm 2025). Một mặt, nhà trường phải kiên định sứ mệnh học thuật cốt lõi là lưu giữ, sáng tạo và lan tỏa tự do tri thức khoa học phụng sự cộng đồng; mặt khác, nhà trường phải thiết lập cơ chế bảo hộ độc quyền để thu hồi chi phí nghiên cứu, tái đầu tư cơ sở vật chất và tạo nguồn thu hợp pháp cho nhà khoa học (Etzkowitz, năm 2003; Shane, năm 2004; Perkmann và cộng sự, năm 2013). Do đó, quản lý sở hữu trí tuệ đại học không thể áp dụng máy móc mô hình doanh nghiệp, mà đòi hỏi một khung quản trị cân bằng giữa sứ mệnh công ích học thuật và hiệu quả kinh tế.</w:t>
+        <w:t xml:space="preserve">Quản lý quyền sở hữu trí tuệ trong cơ sở giáo dục đại học là hệ thống các hoạt động có chủ đích nhằm hoạch định chính sách thể chế, ban hành quy chế nội bộ, thiết lập bộ máy chuyên trách và vận hành các quy trình nghiệp vụ để điều tiết toàn bộ chu trình sống của tài sản trí tuệ, bao gồm toàn bộ tiến trình từ khâu hình thành ý tưởng nghiên cứu, thẩm định tính mới, bảo mật thông tin, đăng ký xác lập quyền bảo hộ, cho đến khai thác thương mại hóa, chuyển giao công nghệ và bảo vệ quyền sở hữu trí tuệ trước các hành vi xâm phạm (Bradley et al., 2013; Goldfarb &amp; Henrekson, 2003).</w:t>
+      </w:r>
+    </w:p>
+    <w:p>
+      <w:pPr>
+        <w:rPr>
+          <w:szCs w:val="26"/>
+        </w:rPr>
+      </w:pPr>
+      <w:r>
+        <w:rPr>
+          <w:szCs w:val="26"/>
+        </w:rPr>
+        <w:t xml:space="preserve">Khác biệt căn bản với khu vực doanh nghiệp thương mại vốn ưu tiên mục tiêu duy nhất là tối đa hóa lợi nhuận tài chính và bảo vệ thị phần độc quyền (Teece, 2018), quản lý sở hữu trí tuệ trong trường đại học mang bản chất lưỡng dụng và đa mục tiêu phức tạp (Nguyễn, 2025). Một mặt, nhà trường phải kiên định sứ mệnh học thuật cốt lõi là lưu giữ, sáng tạo và lan tỏa tự do tri thức khoa học phụng sự cộng đồng; mặt khác, nhà trường phải thiết lập cơ chế bảo hộ độc quyền để thu hồi chi phí nghiên cứu, tái đầu tư cơ sở vật chất và tạo nguồn thu hợp pháp cho nhà khoa học (Etzkowitz, 2003; Perkmann et al., 2013; Shane, 2004). Do đó, quản lý sở hữu trí tuệ đại học không thể áp dụng máy móc mô hình doanh nghiệp, mà đòi hỏi một khung quản trị cân bằng giữa sứ mệnh công ích học thuật và hiệu quả kinh tế.</w:t>
       </w:r>
     </w:p>
     <w:p>
@@ -383,7 +383,7 @@
         <w:rPr>
           <w:szCs w:val="26"/>
         </w:rPr>
-        <w:t xml:space="preserve"> Tài sản trí tuệ đại học không tồn tại dưới dạng vật chất cố định. Rất nhiều tri thức có giá trị cao như phương pháp nghiên cứu, giải thuật phần mềm hay ý tưởng sáng tạo ban đầu tồn tại dưới dạng tri thức ẩn trong tư duy của giảng viên, gây khó khăn cho công tác kiểm kê, định giá và quản trị của nhà trường (Tewari và Bhardwaj, năm 2020).</w:t>
+        <w:t xml:space="preserve"> Tài sản trí tuệ đại học không tồn tại dưới dạng vật chất cố định. Rất nhiều tri thức có giá trị cao như phương pháp nghiên cứu, giải thuật phần mềm hay ý tưởng sáng tạo ban đầu tồn tại dưới dạng tri thức ẩn trong tư duy của giảng viên, gây khó khăn cho công tác kiểm kê, định giá và quản trị của nhà trường.</w:t>
       </w:r>
     </w:p>
     <w:p>
@@ -409,7 +409,7 @@
         <w:rPr>
           <w:szCs w:val="26"/>
         </w:rPr>
-        <w:t xml:space="preserve"> Việc một người tiếp nhận, sử dụng một tri thức khoa học không làm suy giảm khả năng tiếp cận của người khác (Fisher, năm 2001; Guan, năm 2014). Đặc tính này đòi hỏi cơ chế pháp lý chuyên biệt để xác lập ranh giới độc quyền khai thác mà không triệt tiêu tính mở của môi trường học thuật.</w:t>
+        <w:t xml:space="preserve"> Việc một người tiếp nhận, sử dụng một tri thức khoa học không làm suy giảm khả năng tiếp cận của người khác (Fisher, 2001; Guan, 2014). Đặc tính này đòi hỏi cơ chế pháp lý chuyên biệt để xác lập ranh giới độc quyền khai thác mà không triệt tiêu tính mở của môi trường học thuật.</w:t>
       </w:r>
     </w:p>
     <w:p>
@@ -435,7 +435,7 @@
         <w:rPr>
           <w:szCs w:val="26"/>
         </w:rPr>
-        <w:t xml:space="preserve"> Tài sản trí tuệ đại học được tạo ra từ nhiều nguồn lực đan xen, bao gồm nhiệm vụ khoa học sử dụng ngân sách nhà nước, đề tài cấp cơ sở dùng kinh phí của trường, hoạt động đồng sáng tạo giữa giảng viên và người học, hoặc dự án hợp tác nghiên cứu theo đơn đặt hàng của doanh nghiệp (Bradley và cộng sự, năm 2013).</w:t>
+        <w:t xml:space="preserve"> Tài sản trí tuệ đại học được tạo ra từ nhiều nguồn lực đan xen, bao gồm nhiệm vụ khoa học sử dụng ngân sách nhà nước, đề tài cấp cơ sở dùng kinh phí của trường, hoạt động đồng sáng tạo giữa giảng viên và người học, hoặc dự án hợp tác nghiên cứu theo đơn đặt hàng của doanh nghiệp (Bradley et al., 2013).</w:t>
       </w:r>
     </w:p>
     <w:p>
@@ -461,7 +461,7 @@
         <w:rPr>
           <w:szCs w:val="26"/>
         </w:rPr>
-        <w:t xml:space="preserve"> Các sản phẩm trí tuệ trong trường đại học bắt buộc phải trải qua quá trình đánh giá trùng lặp và thẩm định chuẩn mực khoa học nghiêm ngặt để phân định rõ ràng giữa sáng tạo độc lập với các hành vi sao chép, đạo văn hay vi phạm chuẩn mực nghiên cứu (Tổ chức Sở hữu trí tuệ thế giới, năm 2020).</w:t>
+        <w:t xml:space="preserve"> Các sản phẩm trí tuệ trong trường đại học bắt buộc phải trải qua quá trình đánh giá trùng lặp và thẩm định chuẩn mực khoa học nghiêm ngặt để phân định rõ ràng giữa sáng tạo độc lập với các hành vi sao chép, đạo văn hay vi phạm chuẩn mực nghiên cứu (Tổ chức Sở hữu trí tuệ thế giới, 2020).</w:t>
       </w:r>
     </w:p>
     <w:p>
@@ -527,7 +527,7 @@
         <w:rPr>
           <w:szCs w:val="26"/>
         </w:rPr>
-        <w:t xml:space="preserve"> Quá trình nghiên cứu đại học quy tụ sự tham gia của nhiều nhóm chủ thể: giảng viên, nghiên cứu viên, chuyên gia doanh nghiệp và sinh viên. Việc phân định chính xác tỷ lệ đóng góp trí tuệ và quyền sở hữu đối với sản phẩm đồng sáng tạo là một thách thức quản trị lớn (Thursby và Thursby, năm 2002).</w:t>
+        <w:t xml:space="preserve"> Quá trình nghiên cứu đại học quy tụ sự tham gia của nhiều nhóm chủ thể: giảng viên, nghiên cứu viên, chuyên gia doanh nghiệp và sinh viên. Việc phân định chính xác tỷ lệ đóng góp trí tuệ và quyền sở hữu đối với sản phẩm đồng sáng tạo là một thách thức quản trị lớn (Perkmann et al., 2013).</w:t>
       </w:r>
     </w:p>
     <w:p>
@@ -553,7 +553,7 @@
         <w:rPr>
           <w:szCs w:val="26"/>
         </w:rPr>
-        <w:t xml:space="preserve"> Nhà trường đóng vai trò là chủ đầu tư cung cấp cơ sở vật chất, phòng thí nghiệm và kinh phí; trong khi giảng viên là người trực tiếp lao động sáng tạo (Shane, năm 2004; Võ Nguyên Hoàng Phúc, năm 2025). Nếu quy chế nội bộ không quy định minh bạch tỷ lệ phân chia thù lao và doanh thu chuyển giao, sẽ dẫn đến hiện tượng nhà khoa học giữ lại kết quả nghiên cứu để tự khai thác bên ngoài, gây thất thoát tài sản của nhà trường. Đồng thời, nhà quản lý phải giải quyết hài hòa xung đột giữa áp lực công bố bài báo sớm để tính điểm chức danh và yêu cầu giữ bí mật tuyệt đối để nộp đơn đăng ký bảo hộ độc quyền sáng chế.</w:t>
+        <w:t xml:space="preserve"> Nhà trường đóng vai trò là chủ đầu tư cung cấp cơ sở vật chất, phòng thí nghiệm và kinh phí; trong khi giảng viên là người trực tiếp lao động sáng tạo (Shane, 2004; Võ, 2025). Nếu quy chế nội bộ không quy định minh bạch tỷ lệ phân chia thù lao và doanh thu chuyển giao, sẽ dẫn đến hiện tượng nhà khoa học giữ lại kết quả nghiên cứu để tự khai thác bên ngoài, gây thất thoát tài sản của nhà trường. Đồng thời, nhà quản lý phải giải quyết hài hòa xung đột giữa áp lực công bố bài báo sớm để tính điểm chức danh và yêu cầu giữ bí mật tuyệt đối để nộp đơn đăng ký bảo hộ độc quyền sáng chế.</w:t>
       </w:r>
     </w:p>
     <w:p>
@@ -928,7 +928,7 @@
         <w:rPr>
           <w:szCs w:val="26"/>
         </w:rPr>
-        <w:t xml:space="preserve">- Hút nguồn vốn đầu tư từ doanh nghiệp: Nhà trường có năng lực quản trị sở hữu trí tuệ chuyên nghiệp sẽ tạo dựng được lòng tin với các đối tác doanh nghiệp, từ đó thu hút các hợp đồng đặt hàng nghiên cứu phát triển và các nguồn tài trợ phòng thí nghiệm quy mô lớn (Rialti và cộng sự, năm 2022).</w:t>
+        <w:t xml:space="preserve">- Hút nguồn vốn đầu tư từ doanh nghiệp: Nhà trường có năng lực quản trị sở hữu trí tuệ chuyên nghiệp sẽ tạo dựng được lòng tin với các đối tác doanh nghiệp, từ đó thu hút các hợp đồng đặt hàng nghiên cứu phát triển và các nguồn tài trợ phòng thí nghiệm quy mô lớn (Rialti et al., 2022).</w:t>
       </w:r>
     </w:p>
     <w:p>
@@ -1221,20 +1221,20 @@
         <w:rPr>
           <w:szCs w:val="26"/>
         </w:rPr>
-        <w:t xml:space="preserve">Thứ nhất, về quyền đối với kết quả nghiên cứu sử dụng ngân sách nhà nước: Luật số 93/2025/QH15 xác lập cơ chế giao quyền quản lý, sử dụng, quyền sở hữu kết quả của nhiệm vụ khoa học, công nghệ và đổi mới sáng tạo cho tổ chức chủ trì. Luật Sở hữu trí tuệ dẫn chiếu trực tiếp cơ chế này tại điểm c khoản 1 Điều 86 để trao quyền đăng ký sáng chế, kiểu dáng công nghiệp, thiết kế bố trí cho tổ chức được giao quyền. Với cơ sở giáo dục đại học chủ trì nhiệm vụ, đây là căn cứ để chủ động xác lập quyền, định giá, chuyển giao, góp vốn hoặc thành lập doanh nghiệp theo Điều 28 Luật Giáo dục đại học số 125/2025/QH15.</w:t>
-      </w:r>
-    </w:p>
-    <w:p>
-      <w:pPr>
-        <w:rPr>
-          <w:szCs w:val="26"/>
-        </w:rPr>
-      </w:pPr>
-      <w:r>
-        <w:rPr>
-          <w:szCs w:val="26"/>
-        </w:rPr>
-        <w:t xml:space="preserve">Thứ hai, về cơ chế thù lao: điểm b khoản 7 Điều 71 Luật số 93/2025/QH15 sửa đổi khoản 1 Điều 135 Luật Sở hữu trí tuệ theo nguyên tắc thỏa thuận, chỉ áp dụng mức mặc định 10% và 15% khi các bên không có thỏa thuận; điểm a khoản 7 Điều 71 sửa đổi điểm b khoản 1 Điều 86 về quyền đăng ký của tổ chức, cá nhân đầu tư kinh phí, phương tiện vật chất.</w:t>
+        <w:t xml:space="preserve">Thứ nhất, về quyền đối với kết quả nghiên cứu: khoản 2 Điều 25 Luật số 93/2025/QH15 quy định tổ chức chủ trì nhiệm vụ khoa học, công nghệ và đổi mới sáng tạo được Nhà nước tự động giao quyền quản lý, sử dụng, quyền sở hữu phần kết quả tương ứng với kinh phí từ ngân sách nhà nước, không phải thực hiện thủ tục giao quyền và không phải bồi hoàn chi phí; khoản 1 Điều 25 xác định tổ chức, cá nhân đóng góp tài sản, tài chính là chủ sở hữu kết quả tương ứng với tỷ lệ đóng góp. Điều 27 cho phép chủ sở hữu tự quyết định việc thương mại hóa, lựa chọn hình thức, giá, phương án góp vốn và phân chia lợi nhuận mà không phải thực hiện thủ tục xử lý tài sản công như giai đoạn trước. Điểm b khoản 2 Điều 37 khẳng định tổ chức ngoài công lập cũng được giao quyền sở hữu hoặc quyền sử dụng kết quả nghiên cứu từ nhiệm vụ sử dụng ngân sách nhà nước do mình thực hiện, và điểm d khoản 2 cho hưởng ưu đãi như đối với tổ chức công lập, qua đó mở ra cơ hội trực tiếp cho trường đại học tư thục. Luật Sở hữu trí tuệ dẫn chiếu cơ chế giao quyền này tại điểm c khoản 1 Điều 86 để trao quyền đăng ký sáng chế, kiểu dáng công nghiệp, thiết kế bố trí cho tổ chức được giao quyền.</w:t>
+      </w:r>
+    </w:p>
+    <w:p>
+      <w:pPr>
+        <w:rPr>
+          <w:szCs w:val="26"/>
+        </w:rPr>
+      </w:pPr>
+      <w:r>
+        <w:rPr>
+          <w:szCs w:val="26"/>
+        </w:rPr>
+        <w:t xml:space="preserve">Thứ hai, về phân chia lợi nhuận: Điều 28 phân biệt hai trường hợp. Với phần lợi nhuận tương ứng kết quả không sử dụng ngân sách nhà nước, chủ sở hữu tự quyết định việc xử lý lợi nhuận, bao gồm thưởng cho tác giả, theo khoản 2. Với phần tương ứng kết quả sử dụng ngân sách nhà nước, điểm a khoản 3 quy định thưởng cho tác giả tối thiểu 30% lợi nhuận thu được từ cho thuê, bán, chuyển nhượng, chuyển giao quyền sử dụng, tự khai thác kết quả, hoặc tối thiểu 30% giá trị kết quả khi góp vốn, liên doanh, liên kết, thành lập doanh nghiệp; khoản 4 bổ sung rằng tác giả sáng chế, kiểu dáng công nghiệp, thiết kế bố trí còn được hưởng quyền lợi theo Luật Sở hữu trí tuệ. Cùng với đó, điểm b khoản 2 Điều 66 cho phép quỹ phát triển khoa học và công nghệ của tổ chức chi cho đăng ký, bảo hộ, quản lý, khai thác quyền sở hữu trí tuệ.</w:t>
       </w:r>
     </w:p>
     <w:p>
@@ -1260,33 +1260,33 @@
         <w:rPr>
           <w:szCs w:val="26"/>
         </w:rPr>
-        <w:t xml:space="preserve">Điểm h khoản 7 Điều 71 Luật số 93/2025/QH15 trực tiếp bãi bỏ Điều 86a, Điều 133a và khoản 2 Điều 135 của Luật Sở hữu trí tuệ. Bằng việc bãi bỏ khoản 2 Điều 135, pháp luật không còn quy định riêng về thù lao đối với kết quả nghiên cứu sử dụng ngân sách nhà nước.</w:t>
-      </w:r>
-    </w:p>
-    <w:p>
-      <w:pPr>
-        <w:rPr>
-          <w:szCs w:val="26"/>
-        </w:rPr>
-      </w:pPr>
-      <w:r>
-        <w:rPr>
-          <w:szCs w:val="26"/>
-        </w:rPr>
-        <w:t xml:space="preserve">Sự đổi mới căn bản này mang lại kết luận pháp lý có ý nghĩa quyết định đối với đề tài: Pháp luật hiện hành đã trao toàn quyền tự chủ thỏa thuận cho cơ sở giáo dục đại học và không hề khống chế mức trần thù lao đối với bất kỳ nguồn kinh phí nào. Hai mức 10% và 15% quy định tại Điều 135 Luật Sở hữu trí tuệ chỉ là mức mặc định áp dụng khi các bên không có thỏa thuận. Vì vậy, pháp luật không ngăn cản Trường Đại học Thành Đô quy định tỷ lệ phân chia lợi nhuận thương mại hóa cho tác giả ở mức cao hơn mức mặc định trong quy chế nội bộ.</w:t>
-      </w:r>
-    </w:p>
-    <w:p>
-      <w:pPr>
-        <w:rPr>
-          <w:szCs w:val="26"/>
-        </w:rPr>
-      </w:pPr>
-      <w:r>
-        <w:rPr>
-          <w:szCs w:val="26"/>
-        </w:rPr>
-        <w:t xml:space="preserve">Giới hạn về thù lao hiện nay vì vậy nằm ở văn bản nội bộ của Nhà trường: mức trần 100 triệu đồng tại điểm a khoản 4 Điều 36 Quy chế hoạt động khoa học công nghệ ban hành kèm Quyết định số 213/QĐ-ĐHTĐ ngày 28 tháng 12 năm 2021, cùng với năm quy định phân chia lợi ích chưa thống nhất trong bốn văn bản nội bộ, gồm cả Quy chế quản trị tài sản trí tuệ ban hành kèm Quyết định số 217/QĐ-ĐHTĐ năm 2024. Đây là căn cứ để Chương 2 đánh giá tính tương thích của quy chế nội bộ và Chương 3 đề xuất hợp nhất quy chế, bãi bỏ mức trần này.</w:t>
+        <w:t xml:space="preserve">Luật số 93/2025/QH15 đã tạo ra bước đột phá thể chế mang tính đồng bộ khi vừa quy định mức thưởng tối thiểu 30% cho tác giả kết quả sử dụng ngân sách nhà nước, vừa sửa đổi Luật Sở hữu trí tuệ tại khoản 7 Điều 71: điểm b sửa khoản 1 Điều 135 theo nguyên tắc thỏa thuận với mức mặc định 10% và 15%; điểm h bãi bỏ Điều 86a, Điều 133a và khoản 2 Điều 135. Pháp luật vì vậy không còn quy định riêng về khung thù lao theo nguồn kinh phí như trước.</w:t>
+      </w:r>
+    </w:p>
+    <w:p>
+      <w:pPr>
+        <w:rPr>
+          <w:szCs w:val="26"/>
+        </w:rPr>
+      </w:pPr>
+      <w:r>
+        <w:rPr>
+          <w:szCs w:val="26"/>
+        </w:rPr>
+        <w:t xml:space="preserve">Sự đổi mới căn bản này mang lại kết luận pháp lý có ý nghĩa quyết định đối với đề tài: Pháp luật hiện hành trao quyền tự chủ thỏa thuận cho cơ sở giáo dục đại học, không đặt mức trần thù lao, đồng thời bảo đảm mức sàn 30% cho tác giả đối với kết quả sử dụng ngân sách nhà nước. Hai mức 10% và 15% quy định tại Điều 135 Luật Sở hữu trí tuệ chỉ là mức mặc định áp dụng khi các bên không có thỏa thuận. Vì vậy, pháp luật không ngăn cản Trường Đại học Thành Đô quy định tỷ lệ phân chia lợi nhuận thương mại hóa cho tác giả ở mức cao hơn mức tối thiểu và mức mặc định trong quy chế nội bộ.</w:t>
+      </w:r>
+    </w:p>
+    <w:p>
+      <w:pPr>
+        <w:rPr>
+          <w:szCs w:val="26"/>
+        </w:rPr>
+      </w:pPr>
+      <w:r>
+        <w:rPr>
+          <w:szCs w:val="26"/>
+        </w:rPr>
+        <w:t xml:space="preserve">Các quy chế nội bộ của Nhà trường, gồm Quy chế hoạt động khoa học công nghệ ban hành kèm Quyết định số 213/QĐ-ĐHTĐ ngày 28 tháng 12 năm 2021 và Quy chế quản trị tài sản trí tuệ ban hành kèm Quyết định số 217/QĐ-ĐHTĐ ngày 21 tháng 11 năm 2024, đều được xây dựng trước khi các luật mới có hiệu lực. Một số quy định như khoản nộp ngân sách và mức trần 100 triệu đồng tại điểm a khoản 4 Điều 36 Quyết định 213 vì vậy cần được cập nhật theo Điều 28 Luật số 93/2025/QH15. Đây là căn cứ để Chương 2 đánh giá tính tương thích của quy chế nội bộ và Chương 3 đề xuất hợp nhất quy chế theo hướng đón đầu luật mới.</w:t>
       </w:r>
     </w:p>
     <w:p>
@@ -1646,7 +1646,7 @@
         <w:rPr>
           <w:szCs w:val="26"/>
         </w:rPr>
-        <w:t xml:space="preserve">Gắn với dòng đời của tài sản trí tuệ trong trường đại học, chu trình quản lý vận hành qua bốn giai đoạn kế tiếp nhau, được tóm tắt tại Bảng 1.1. Hoạt động bảo vệ quyền đồng thời diễn ra xuyên suốt cả bốn giai đoạn như đã phân tích tại Mục 1.1.3.</w:t>
+        <w:t xml:space="preserve">Gắn với dòng đời của tài sản trí tuệ trong trường đại học, chu trình quản lý vận hành qua bốn giai đoạn kế tiếp nhau, được tóm tắt tại Hình 1.1. Hoạt động bảo vệ quyền đồng thời diễn ra xuyên suốt cả bốn giai đoạn như đã phân tích tại Mục 1.1.3.</w:t>
       </w:r>
     </w:p>
     <w:p>
@@ -1664,331 +1664,54 @@
           <w:b/>
           <w:szCs w:val="26"/>
         </w:rPr>
-        <w:t>Bảng 1.1. Chu trình bốn giai đoạn quản lý quyền sở hữu trí tuệ trong trường đại học</w:t>
-      </w:r>
-    </w:p>
-    <w:tbl>
-      <w:tblPr>
-        <w:tblStyle w:val="TableGrid"/>
-        <w:tblW w:w="0" w:type="auto"/>
+        <w:t>Hình 1.1. Chu trình bốn giai đoạn quản lý quyền sở hữu trí tuệ trong trường đại học</w:t>
+      </w:r>
+    </w:p>
+    <w:p>
+      <w:pPr>
+        <w:keepNext/>
+        <w:spacing w:before="0" w:after="0" w:line="240" w:lineRule="auto"/>
+        <w:ind w:firstLine="0"/>
         <w:jc w:val="center"/>
-        <w:tblLook w:val="04A0" w:firstRow="1" w:lastRow="0" w:firstColumn="1" w:lastColumn="0" w:noHBand="0" w:noVBand="1"/>
-      </w:tblPr>
-      <w:tblGrid>
-        <w:gridCol w:w="1934"/>
-        <w:gridCol w:w="4474"/>
-        <w:gridCol w:w="2660"/>
-      </w:tblGrid>
-      <w:tr>
-        <w:trPr>
-          <w:tblHeader/>
-          <w:cantSplit/>
-        </w:trPr>
-        <w:tc>
-          <w:tcPr>
-            <w:tcW w:w="1934" w:type="dxa"/>
-            <w:shd w:val="clear" w:color="auto" w:fill="DCE8F7"/>
-            <w:vAlign w:val="center"/>
-          </w:tcPr>
-          <w:p>
-            <w:pPr>
-              <w:spacing w:before="20" w:after="20" w:line="252" w:lineRule="auto"/>
-              <w:ind w:firstLine="0"/>
-              <w:jc w:val="center"/>
-            </w:pPr>
-            <w:r>
-              <w:rPr>
-                <w:b/>
-                <w:sz w:val="24"/>
-              </w:rPr>
-              <w:t xml:space="preserve">Giai đoạn</w:t>
-            </w:r>
-          </w:p>
-        </w:tc>
-        <w:tc>
-          <w:tcPr>
-            <w:tcW w:w="4474" w:type="dxa"/>
-            <w:shd w:val="clear" w:color="auto" w:fill="DCE8F7"/>
-            <w:vAlign w:val="center"/>
-          </w:tcPr>
-          <w:p>
-            <w:pPr>
-              <w:spacing w:before="20" w:after="20" w:line="252" w:lineRule="auto"/>
-              <w:ind w:firstLine="0"/>
-              <w:jc w:val="center"/>
-            </w:pPr>
-            <w:r>
-              <w:rPr>
-                <w:b/>
-                <w:sz w:val="24"/>
-              </w:rPr>
-              <w:t xml:space="preserve">Hoạt động nghiệp vụ chủ yếu</w:t>
-            </w:r>
-          </w:p>
-        </w:tc>
-        <w:tc>
-          <w:tcPr>
-            <w:tcW w:w="2660" w:type="dxa"/>
-            <w:shd w:val="clear" w:color="auto" w:fill="DCE8F7"/>
-            <w:vAlign w:val="center"/>
-          </w:tcPr>
-          <w:p>
-            <w:pPr>
-              <w:spacing w:before="20" w:after="20" w:line="252" w:lineRule="auto"/>
-              <w:ind w:firstLine="0"/>
-              <w:jc w:val="center"/>
-            </w:pPr>
-            <w:r>
-              <w:rPr>
-                <w:b/>
-                <w:sz w:val="24"/>
-              </w:rPr>
-              <w:t xml:space="preserve">Sản phẩm quản lý</w:t>
-            </w:r>
-          </w:p>
-        </w:tc>
-      </w:tr>
-      <w:tr>
-        <w:trPr/>
-        <w:tc>
-          <w:tcPr>
-            <w:tcW w:w="1934" w:type="dxa"/>
-            <w:vAlign w:val="center"/>
-          </w:tcPr>
-          <w:p>
-            <w:pPr>
-              <w:spacing w:before="20" w:after="20" w:line="252" w:lineRule="auto"/>
-              <w:ind w:firstLine="0"/>
-              <w:jc w:val="left"/>
-            </w:pPr>
-            <w:r>
-              <w:rPr>
-                <w:sz w:val="24"/>
-              </w:rPr>
-              <w:t xml:space="preserve">1. Tạo lập và nhận diện quyền</w:t>
-            </w:r>
-          </w:p>
-        </w:tc>
-        <w:tc>
-          <w:tcPr>
-            <w:tcW w:w="4474" w:type="dxa"/>
-            <w:vAlign w:val="center"/>
-          </w:tcPr>
-          <w:p>
-            <w:pPr>
-              <w:spacing w:before="20" w:after="20" w:line="252" w:lineRule="auto"/>
-              <w:ind w:firstLine="0"/>
-              <w:jc w:val="left"/>
-            </w:pPr>
-            <w:r>
-              <w:rPr>
-                <w:sz w:val="24"/>
-              </w:rPr>
-              <w:t xml:space="preserve">Tiếp nhận ý tưởng, sàng lọc đề tài tiềm năng, khai báo phát minh nội bộ, thẩm định tính mới trước khi công bố</w:t>
-            </w:r>
-          </w:p>
-        </w:tc>
-        <w:tc>
-          <w:tcPr>
-            <w:tcW w:w="2660" w:type="dxa"/>
-            <w:vAlign w:val="center"/>
-          </w:tcPr>
-          <w:p>
-            <w:pPr>
-              <w:spacing w:before="20" w:after="20" w:line="252" w:lineRule="auto"/>
-              <w:ind w:firstLine="0"/>
-              <w:jc w:val="left"/>
-            </w:pPr>
-            <w:r>
-              <w:rPr>
-                <w:sz w:val="24"/>
-              </w:rPr>
-              <w:t xml:space="preserve">Phiếu khai báo, biên bản rà soát khả năng bảo hộ</w:t>
-            </w:r>
-          </w:p>
-        </w:tc>
-      </w:tr>
-      <w:tr>
-        <w:trPr/>
-        <w:tc>
-          <w:tcPr>
-            <w:tcW w:w="1934" w:type="dxa"/>
-            <w:vAlign w:val="center"/>
-          </w:tcPr>
-          <w:p>
-            <w:pPr>
-              <w:spacing w:before="20" w:after="20" w:line="252" w:lineRule="auto"/>
-              <w:ind w:firstLine="0"/>
-              <w:jc w:val="left"/>
-            </w:pPr>
-            <w:r>
-              <w:rPr>
-                <w:sz w:val="24"/>
-              </w:rPr>
-              <w:t xml:space="preserve">2. Xác lập quyền</w:t>
-            </w:r>
-          </w:p>
-        </w:tc>
-        <w:tc>
-          <w:tcPr>
-            <w:tcW w:w="4474" w:type="dxa"/>
-            <w:vAlign w:val="center"/>
-          </w:tcPr>
-          <w:p>
-            <w:pPr>
-              <w:spacing w:before="20" w:after="20" w:line="252" w:lineRule="auto"/>
-              <w:ind w:firstLine="0"/>
-              <w:jc w:val="left"/>
-            </w:pPr>
-            <w:r>
-              <w:rPr>
-                <w:sz w:val="24"/>
-              </w:rPr>
-              <w:t xml:space="preserve">Chuẩn bị hồ sơ, bố trí kinh phí, nộp đơn cấp văn bằng sở hữu công nghiệp hoặc đăng ký quyền tác giả</w:t>
-            </w:r>
-          </w:p>
-        </w:tc>
-        <w:tc>
-          <w:tcPr>
-            <w:tcW w:w="2660" w:type="dxa"/>
-            <w:vAlign w:val="center"/>
-          </w:tcPr>
-          <w:p>
-            <w:pPr>
-              <w:spacing w:before="20" w:after="20" w:line="252" w:lineRule="auto"/>
-              <w:ind w:firstLine="0"/>
-              <w:jc w:val="left"/>
-            </w:pPr>
-            <w:r>
-              <w:rPr>
-                <w:sz w:val="24"/>
-              </w:rPr>
-              <w:t xml:space="preserve">Đơn đăng ký, văn bằng, giấy chứng nhận</w:t>
-            </w:r>
-          </w:p>
-        </w:tc>
-      </w:tr>
-      <w:tr>
-        <w:trPr/>
-        <w:tc>
-          <w:tcPr>
-            <w:tcW w:w="1934" w:type="dxa"/>
-            <w:vAlign w:val="center"/>
-          </w:tcPr>
-          <w:p>
-            <w:pPr>
-              <w:spacing w:before="20" w:after="20" w:line="252" w:lineRule="auto"/>
-              <w:ind w:firstLine="0"/>
-              <w:jc w:val="left"/>
-            </w:pPr>
-            <w:r>
-              <w:rPr>
-                <w:sz w:val="24"/>
-              </w:rPr>
-              <w:t xml:space="preserve">3. Khai thác và thương mại hóa</w:t>
-            </w:r>
-          </w:p>
-        </w:tc>
-        <w:tc>
-          <w:tcPr>
-            <w:tcW w:w="4474" w:type="dxa"/>
-            <w:vAlign w:val="center"/>
-          </w:tcPr>
-          <w:p>
-            <w:pPr>
-              <w:spacing w:before="20" w:after="20" w:line="252" w:lineRule="auto"/>
-              <w:ind w:firstLine="0"/>
-              <w:jc w:val="left"/>
-            </w:pPr>
-            <w:r>
-              <w:rPr>
-                <w:sz w:val="24"/>
-              </w:rPr>
-              <w:t xml:space="preserve">Sử dụng trong giảng dạy, chuyển giao quyền sử dụng, góp vốn, thành lập doanh nghiệp, sản xuất thử nghiệm</w:t>
-            </w:r>
-          </w:p>
-        </w:tc>
-        <w:tc>
-          <w:tcPr>
-            <w:tcW w:w="2660" w:type="dxa"/>
-            <w:vAlign w:val="center"/>
-          </w:tcPr>
-          <w:p>
-            <w:pPr>
-              <w:spacing w:before="20" w:after="20" w:line="252" w:lineRule="auto"/>
-              <w:ind w:firstLine="0"/>
-              <w:jc w:val="left"/>
-            </w:pPr>
-            <w:r>
-              <w:rPr>
-                <w:sz w:val="24"/>
-              </w:rPr>
-              <w:t xml:space="preserve">Hợp đồng chuyển giao, cấp phép, doanh thu</w:t>
-            </w:r>
-          </w:p>
-        </w:tc>
-      </w:tr>
-      <w:tr>
-        <w:trPr/>
-        <w:tc>
-          <w:tcPr>
-            <w:tcW w:w="1934" w:type="dxa"/>
-            <w:vAlign w:val="center"/>
-          </w:tcPr>
-          <w:p>
-            <w:pPr>
-              <w:spacing w:before="20" w:after="20" w:line="252" w:lineRule="auto"/>
-              <w:ind w:firstLine="0"/>
-              <w:jc w:val="left"/>
-            </w:pPr>
-            <w:r>
-              <w:rPr>
-                <w:sz w:val="24"/>
-              </w:rPr>
-              <w:t xml:space="preserve">4. Bảo vệ và phân chia lợi ích</w:t>
-            </w:r>
-          </w:p>
-        </w:tc>
-        <w:tc>
-          <w:tcPr>
-            <w:tcW w:w="4474" w:type="dxa"/>
-            <w:vAlign w:val="center"/>
-          </w:tcPr>
-          <w:p>
-            <w:pPr>
-              <w:spacing w:before="20" w:after="20" w:line="252" w:lineRule="auto"/>
-              <w:ind w:firstLine="0"/>
-              <w:jc w:val="left"/>
-            </w:pPr>
-            <w:r>
-              <w:rPr>
-                <w:sz w:val="24"/>
-              </w:rPr>
-              <w:t xml:space="preserve">Giám sát xâm phạm, bảo vệ quyền lợi của nhà trường và tác giả, chi trả thù lao, trích quỹ tái đầu tư</w:t>
-            </w:r>
-          </w:p>
-        </w:tc>
-        <w:tc>
-          <w:tcPr>
-            <w:tcW w:w="2660" w:type="dxa"/>
-            <w:vAlign w:val="center"/>
-          </w:tcPr>
-          <w:p>
-            <w:pPr>
-              <w:spacing w:before="20" w:after="20" w:line="252" w:lineRule="auto"/>
-              <w:ind w:firstLine="0"/>
-              <w:jc w:val="left"/>
-            </w:pPr>
-            <w:r>
-              <w:rPr>
-                <w:sz w:val="24"/>
-              </w:rPr>
-              <w:t xml:space="preserve">Sổ theo dõi hiệu lực, chứng từ chi trả, quỹ phát triển khoa học công nghệ</w:t>
-            </w:r>
-          </w:p>
-        </w:tc>
-      </w:tr>
-    </w:tbl>
+        <w:rPr>
+          <w:szCs w:val="26"/>
+        </w:rPr>
+      </w:pPr>
+      <w:r>
+        <w:drawing>
+          <wp:inline xmlns:a="http://schemas.openxmlformats.org/drawingml/2006/main" xmlns:pic="http://schemas.openxmlformats.org/drawingml/2006/picture">
+            <wp:extent cx="5580000" cy="3960000"/>
+            <wp:docPr id="1" name="Picture 1"/>
+            <wp:cNvGraphicFramePr>
+              <a:graphicFrameLocks noChangeAspect="1"/>
+            </wp:cNvGraphicFramePr>
+            <a:graphic>
+              <a:graphicData uri="http://schemas.openxmlformats.org/drawingml/2006/picture">
+                <pic:pic>
+                  <pic:nvPicPr>
+                    <pic:cNvPr id="0" name="chu_trinh.png"/>
+                    <pic:cNvPicPr/>
+                  </pic:nvPicPr>
+                  <pic:blipFill>
+                    <a:blip r:embed="rId6"/>
+                    <a:stretch>
+                      <a:fillRect/>
+                    </a:stretch>
+                  </pic:blipFill>
+                  <pic:spPr>
+                    <a:xfrm>
+                      <a:off x="0" y="0"/>
+                      <a:ext cx="5580000" cy="3960000"/>
+                    </a:xfrm>
+                    <a:prstGeom prst="rect"/>
+                  </pic:spPr>
+                </pic:pic>
+              </a:graphicData>
+            </a:graphic>
+          </wp:inline>
+        </w:drawing>
+      </w:r>
+    </w:p>
     <w:p>
       <w:pPr>
         <w:spacing w:after="160"/>
@@ -2002,7 +1725,7 @@
           <w:i/>
           <w:szCs w:val="26"/>
         </w:rPr>
-        <w:t>Nguồn: Nhóm nghiên cứu tổng hợp từ Bradley và cộng sự, năm 2013; Tổ chức Sở hữu trí tuệ thế giới, năm 2020.</w:t>
+        <w:t>Nguồn: Nhóm nghiên cứu xây dựng trên cơ sở Bradley et al., 2013 và Tổ chức Sở hữu trí tuệ thế giới, 2020.</w:t>
       </w:r>
     </w:p>
     <w:p>
@@ -2033,7 +1756,7 @@
         <w:rPr>
           <w:szCs w:val="26"/>
         </w:rPr>
-        <w:t xml:space="preserve">Hiệu quả quản lý quyền sở hữu trí tuệ được lượng hóa và đánh giá khách quan thông qua chuỗi logic bốn mắt xích: đầu vào, quá trình, đầu ra và kết quả. Mười sáu tiêu chí thuộc bốn nhóm được trình bày tại Bảng 1.2; đây cũng là bộ tiêu chí được dùng để đánh giá khả năng đo lường của hệ thống dữ liệu tại Chương 2.</w:t>
+        <w:t xml:space="preserve">Hiệu quả quản lý quyền sở hữu trí tuệ được lượng hóa và đánh giá khách quan thông qua chuỗi logic bốn mắt xích: đầu vào, quá trình, đầu ra và kết quả. Mười sáu tiêu chí thuộc bốn nhóm được trình bày tại Bảng 1.1; đây cũng là bộ tiêu chí được dùng để đánh giá khả năng đo lường của hệ thống dữ liệu tại Chương 2.</w:t>
       </w:r>
     </w:p>
     <w:p>
@@ -2051,7 +1774,7 @@
           <w:b/>
           <w:szCs w:val="26"/>
         </w:rPr>
-        <w:t>Bảng 1.2. Bộ tiêu chí đánh giá hiệu quả quản lý quyền sở hữu trí tuệ theo chuỗi</w:t>
+        <w:t>Bảng 1.1. Bộ tiêu chí đánh giá hiệu quả quản lý quyền sở hữu trí tuệ theo chuỗi</w:t>
       </w:r>
     </w:p>
     <w:tbl>
@@ -2653,6 +2376,85 @@
     <w:p>
       <w:pPr>
         <w:keepNext/>
+        <w:spacing w:before="160" w:after="80"/>
+        <w:ind w:firstLine="0"/>
+        <w:jc w:val="center"/>
+        <w:rPr>
+          <w:szCs w:val="26"/>
+        </w:rPr>
+      </w:pPr>
+      <w:r>
+        <w:rPr>
+          <w:b/>
+          <w:szCs w:val="26"/>
+        </w:rPr>
+        <w:t>Hình 1.2. Sáu nhóm yếu tố ảnh hưởng đến hiệu quả quản lý quyền sở hữu trí tuệ</w:t>
+      </w:r>
+    </w:p>
+    <w:p>
+      <w:pPr>
+        <w:keepNext/>
+        <w:spacing w:before="0" w:after="0" w:line="240" w:lineRule="auto"/>
+        <w:ind w:firstLine="0"/>
+        <w:jc w:val="center"/>
+        <w:rPr>
+          <w:szCs w:val="26"/>
+        </w:rPr>
+      </w:pPr>
+      <w:r>
+        <w:drawing>
+          <wp:inline xmlns:a="http://schemas.openxmlformats.org/drawingml/2006/main" xmlns:pic="http://schemas.openxmlformats.org/drawingml/2006/picture">
+            <wp:extent cx="5580000" cy="3096000"/>
+            <wp:docPr id="2" name="Picture 2"/>
+            <wp:cNvGraphicFramePr>
+              <a:graphicFrameLocks noChangeAspect="1"/>
+            </wp:cNvGraphicFramePr>
+            <a:graphic>
+              <a:graphicData uri="http://schemas.openxmlformats.org/drawingml/2006/picture">
+                <pic:pic>
+                  <pic:nvPicPr>
+                    <pic:cNvPr id="0" name="yeu_to.png"/>
+                    <pic:cNvPicPr/>
+                  </pic:nvPicPr>
+                  <pic:blipFill>
+                    <a:blip r:embed="rId9"/>
+                    <a:stretch>
+                      <a:fillRect/>
+                    </a:stretch>
+                  </pic:blipFill>
+                  <pic:spPr>
+                    <a:xfrm>
+                      <a:off x="0" y="0"/>
+                      <a:ext cx="5580000" cy="3096000"/>
+                    </a:xfrm>
+                    <a:prstGeom prst="rect"/>
+                  </pic:spPr>
+                </pic:pic>
+              </a:graphicData>
+            </a:graphic>
+          </wp:inline>
+        </w:drawing>
+      </w:r>
+    </w:p>
+    <w:p>
+      <w:pPr>
+        <w:spacing w:after="160"/>
+        <w:ind w:firstLine="0"/>
+        <w:rPr>
+          <w:szCs w:val="26"/>
+        </w:rPr>
+      </w:pPr>
+      <w:r>
+        <w:rPr>
+          <w:i/>
+          <w:szCs w:val="26"/>
+        </w:rPr>
+        <w:t>Nguồn: Nhóm nghiên cứu tổng hợp.</w:t>
+      </w:r>
+    </w:p>
+    <w:p>
+      <w:pPr>
+        <w:keepNext/>
         <w:spacing w:before="280" w:after="160"/>
         <w:ind w:firstLine="0"/>
         <w:outlineLvl w:val="1"/>
@@ -2723,33 +2525,33 @@
         <w:rPr>
           <w:szCs w:val="26"/>
         </w:rPr>
-        <w:t xml:space="preserve">- Đạo luật Bayh-Dole năm 1980 của Hoa Kỳ là một minh chứng lịch sử về việc phân cấp quyền sở hữu kết quả nghiên cứu sử dụng ngân sách nhà nước cho trường đại học, thúc đẩy việc thành lập các văn phòng chuyển giao công nghệ và sự gia tăng của các doanh nghiệp khởi nguồn tri thức từ đại học (Shane, năm 2004; Mowery và cộng sự, năm 2004).</w:t>
-      </w:r>
-    </w:p>
-    <w:p>
-      <w:pPr>
-        <w:rPr>
-          <w:szCs w:val="26"/>
-        </w:rPr>
-      </w:pPr>
-      <w:r>
-        <w:rPr>
-          <w:szCs w:val="26"/>
-        </w:rPr>
-        <w:t xml:space="preserve">- Vai trò trung gian chuyên nghiệp của đơn vị chuyển giao công nghệ: Đơn vị này không chỉ làm thủ tục hành chính nộp đơn, mà giữ vai trò tiếp thị công nghệ, định giá tài sản vô hình và kết nối chặt chẽ với mạng lưới các quỹ đầu tư mạo hiểm (Siegel và cộng sự, năm 2007; Thursby và Thursby, năm 2002).</w:t>
-      </w:r>
-    </w:p>
-    <w:p>
-      <w:pPr>
-        <w:rPr>
-          <w:szCs w:val="26"/>
-        </w:rPr>
-      </w:pPr>
-      <w:r>
-        <w:rPr>
-          <w:szCs w:val="26"/>
-        </w:rPr>
-        <w:t xml:space="preserve">- Cơ chế chia sẻ doanh thu hấp dẫn: Các trường đại học hàng đầu thế giới thường duy trì tỷ lệ chia sẻ lợi nhuận cho nhà sáng chế từ 40% đến 60%, thậm chí lên đến 70% đối với các công nghệ giai đoạn đầu, tạo động lực vật chất tối đa cho các nhà khoa học (Etzkowitz, năm 2003).</w:t>
+        <w:t xml:space="preserve">- Đạo luật Bayh-Dole năm 1980 của Hoa Kỳ là một minh chứng lịch sử về việc phân cấp quyền sở hữu kết quả nghiên cứu sử dụng ngân sách nhà nước cho trường đại học, thúc đẩy việc thành lập các văn phòng chuyển giao công nghệ và sự gia tăng của các doanh nghiệp khởi nguồn tri thức từ đại học (Shane, 2004).</w:t>
+      </w:r>
+    </w:p>
+    <w:p>
+      <w:pPr>
+        <w:rPr>
+          <w:szCs w:val="26"/>
+        </w:rPr>
+      </w:pPr>
+      <w:r>
+        <w:rPr>
+          <w:szCs w:val="26"/>
+        </w:rPr>
+        <w:t xml:space="preserve">- Vai trò trung gian chuyên nghiệp của đơn vị chuyển giao công nghệ: Đơn vị này không chỉ làm thủ tục hành chính nộp đơn, mà giữ vai trò tiếp thị công nghệ, định giá tài sản vô hình và kết nối chặt chẽ với mạng lưới các quỹ đầu tư mạo hiểm (Siegel et al., 2007; Thursby &amp; Kemp, 2002).</w:t>
+      </w:r>
+    </w:p>
+    <w:p>
+      <w:pPr>
+        <w:rPr>
+          <w:szCs w:val="26"/>
+        </w:rPr>
+      </w:pPr>
+      <w:r>
+        <w:rPr>
+          <w:szCs w:val="26"/>
+        </w:rPr>
+        <w:t xml:space="preserve">- Cơ chế chia sẻ doanh thu hấp dẫn: Tỷ lệ chia sẻ doanh thu dành cho nhà sáng chế là một yếu tố động lực quan trọng; các trường đại học thành công trong chuyển giao thường dành cho nhà sáng chế một tỷ lệ đáng kể trong doanh thu cấp phép (Siegel et al., 2007).</w:t>
       </w:r>
     </w:p>
     <w:p>
@@ -3075,7 +2877,7 @@
         <w:rPr>
           <w:szCs w:val="26"/>
         </w:rPr>
-        <w:t xml:space="preserve">Trên cơ sở tích hợp hệ thống lý luận về chu trình quản lý, khung pháp lý mới nhất năm 2025 - 2026, bộ tiêu chí đánh giá và cách tiếp cận thử nghiệm mở, đề tài xây dựng Khung phân tích logic xuyên suốt cho toàn bộ công trình nghiên cứu, được trình bày tại Bảng 1.3.</w:t>
+        <w:t xml:space="preserve">Trên cơ sở tích hợp hệ thống lý luận về chu trình quản lý, khung pháp lý mới nhất năm 2025 - 2026, bộ tiêu chí đánh giá và cách tiếp cận thử nghiệm mở, đề tài xây dựng Khung phân tích logic xuyên suốt cho toàn bộ công trình nghiên cứu, được trình bày tại Hình 1.3.</w:t>
       </w:r>
     </w:p>
     <w:p>
@@ -3093,363 +2895,54 @@
           <w:b/>
           <w:szCs w:val="26"/>
         </w:rPr>
-        <w:t>Bảng 1.3. Khung phân tích của đề tài</w:t>
-      </w:r>
-    </w:p>
-    <w:tbl>
-      <w:tblPr>
-        <w:tblStyle w:val="TableGrid"/>
-        <w:tblW w:w="0" w:type="auto"/>
+        <w:t>Hình 1.3. Khung phân tích của đề tài</w:t>
+      </w:r>
+    </w:p>
+    <w:p>
+      <w:pPr>
+        <w:keepNext/>
+        <w:spacing w:before="0" w:after="0" w:line="240" w:lineRule="auto"/>
+        <w:ind w:firstLine="0"/>
         <w:jc w:val="center"/>
-        <w:tblLook w:val="04A0" w:firstRow="1" w:lastRow="0" w:firstColumn="1" w:lastColumn="0" w:noHBand="0" w:noVBand="1"/>
-      </w:tblPr>
-      <w:tblGrid>
-        <w:gridCol w:w="2418"/>
-        <w:gridCol w:w="6651"/>
-      </w:tblGrid>
-      <w:tr>
-        <w:trPr>
-          <w:tblHeader/>
-          <w:cantSplit/>
-        </w:trPr>
-        <w:tc>
-          <w:tcPr>
-            <w:tcW w:w="2418" w:type="dxa"/>
-            <w:shd w:val="clear" w:color="auto" w:fill="DCE8F7"/>
-            <w:vAlign w:val="center"/>
-          </w:tcPr>
-          <w:p>
-            <w:pPr>
-              <w:spacing w:before="20" w:after="20" w:line="252" w:lineRule="auto"/>
-              <w:ind w:firstLine="0"/>
-              <w:jc w:val="center"/>
-            </w:pPr>
-            <w:r>
-              <w:rPr>
-                <w:b/>
-                <w:sz w:val="24"/>
-              </w:rPr>
-              <w:t xml:space="preserve">Cấp độ phân tích</w:t>
-            </w:r>
-          </w:p>
-        </w:tc>
-        <w:tc>
-          <w:tcPr>
-            <w:tcW w:w="6651" w:type="dxa"/>
-            <w:shd w:val="clear" w:color="auto" w:fill="DCE8F7"/>
-            <w:vAlign w:val="center"/>
-          </w:tcPr>
-          <w:p>
-            <w:pPr>
-              <w:spacing w:before="20" w:after="20" w:line="252" w:lineRule="auto"/>
-              <w:ind w:firstLine="0"/>
-              <w:jc w:val="center"/>
-            </w:pPr>
-            <w:r>
-              <w:rPr>
-                <w:b/>
-                <w:sz w:val="24"/>
-              </w:rPr>
-              <w:t xml:space="preserve">Nội dung cốt lõi và mắt xích liên kết</w:t>
-            </w:r>
-          </w:p>
-        </w:tc>
-      </w:tr>
-      <w:tr>
-        <w:trPr/>
-        <w:tc>
-          <w:tcPr>
-            <w:tcW w:w="2418" w:type="dxa"/>
-            <w:vAlign w:val="center"/>
-          </w:tcPr>
-          <w:p>
-            <w:pPr>
-              <w:spacing w:before="20" w:after="20" w:line="252" w:lineRule="auto"/>
-              <w:ind w:firstLine="0"/>
-              <w:jc w:val="left"/>
-            </w:pPr>
-            <w:r>
-              <w:rPr>
-                <w:sz w:val="24"/>
-              </w:rPr>
-              <w:t xml:space="preserve">1. Bối cảnh và căn cứ pháp lý</w:t>
-            </w:r>
-          </w:p>
-        </w:tc>
-        <w:tc>
-          <w:tcPr>
-            <w:tcW w:w="6651" w:type="dxa"/>
-            <w:vAlign w:val="center"/>
-          </w:tcPr>
-          <w:p>
-            <w:pPr>
-              <w:spacing w:before="20" w:after="20" w:line="252" w:lineRule="auto"/>
-              <w:ind w:firstLine="0"/>
-              <w:jc w:val="left"/>
-            </w:pPr>
-            <w:r>
-              <w:rPr>
-                <w:sz w:val="24"/>
-              </w:rPr>
-              <w:t xml:space="preserve">- Luật Sở hữu trí tuệ hợp nhất năm 2026, Luật Khoa học, công nghệ và đổi mới sáng tạo năm 2025, Luật Giáo dục đại học năm 2025, Chiến lược sở hữu trí tuệ đến năm 2030 được sửa đổi năm 2026.</w:t>
-            </w:r>
-          </w:p>
-          <w:p>
-            <w:pPr>
-              <w:spacing w:before="20" w:after="20" w:line="252" w:lineRule="auto"/>
-              <w:ind w:firstLine="0"/>
-              <w:jc w:val="left"/>
-            </w:pPr>
-            <w:r>
-              <w:rPr>
-                <w:sz w:val="24"/>
-              </w:rPr>
-              <w:t xml:space="preserve">- Chuẩn cơ sở giáo dục đại học theo Thông tư số 01/2024/TT-BGDĐT, được thay thế bởi Thông tư số 83/2026/TT-BGDĐT từ ngày 15 tháng 11 năm 2026, và tiêu chuẩn kiểm định chất lượng.</w:t>
-            </w:r>
-          </w:p>
-        </w:tc>
-      </w:tr>
-      <w:tr>
-        <w:trPr/>
-        <w:tc>
-          <w:tcPr>
-            <w:tcW w:w="2418" w:type="dxa"/>
-            <w:vAlign w:val="center"/>
-          </w:tcPr>
-          <w:p>
-            <w:pPr>
-              <w:spacing w:before="20" w:after="20" w:line="252" w:lineRule="auto"/>
-              <w:ind w:firstLine="0"/>
-              <w:jc w:val="left"/>
-            </w:pPr>
-            <w:r>
-              <w:rPr>
-                <w:sz w:val="24"/>
-              </w:rPr>
-              <w:t xml:space="preserve">2. Khung lý thuyết quản lý quyền sở hữu trí tuệ</w:t>
-            </w:r>
-          </w:p>
-        </w:tc>
-        <w:tc>
-          <w:tcPr>
-            <w:tcW w:w="6651" w:type="dxa"/>
-            <w:vAlign w:val="center"/>
-          </w:tcPr>
-          <w:p>
-            <w:pPr>
-              <w:spacing w:before="20" w:after="20" w:line="252" w:lineRule="auto"/>
-              <w:ind w:firstLine="0"/>
-              <w:jc w:val="left"/>
-            </w:pPr>
-            <w:r>
-              <w:rPr>
-                <w:sz w:val="24"/>
-              </w:rPr>
-              <w:t xml:space="preserve">- Bốn chức năng quản lý: hoạch định, tổ chức, thực hiện, kiểm tra và giám sát.</w:t>
-            </w:r>
-          </w:p>
-          <w:p>
-            <w:pPr>
-              <w:spacing w:before="20" w:after="20" w:line="252" w:lineRule="auto"/>
-              <w:ind w:firstLine="0"/>
-              <w:jc w:val="left"/>
-            </w:pPr>
-            <w:r>
-              <w:rPr>
-                <w:sz w:val="24"/>
-              </w:rPr>
-              <w:t xml:space="preserve">- Chu trình bốn giai đoạn: tạo lập và nhận diện, xác lập, khai thác và thương mại hóa, bảo vệ và phân chia lợi ích.</w:t>
-            </w:r>
-          </w:p>
-          <w:p>
-            <w:pPr>
-              <w:spacing w:before="20" w:after="20" w:line="252" w:lineRule="auto"/>
-              <w:ind w:firstLine="0"/>
-              <w:jc w:val="left"/>
-            </w:pPr>
-            <w:r>
-              <w:rPr>
-                <w:sz w:val="24"/>
-              </w:rPr>
-              <w:t xml:space="preserve">- Mười sáu tiêu chí theo chuỗi đầu vào, quá trình, đầu ra, kết quả.</w:t>
-            </w:r>
-          </w:p>
-          <w:p>
-            <w:pPr>
-              <w:spacing w:before="20" w:after="20" w:line="252" w:lineRule="auto"/>
-              <w:ind w:firstLine="0"/>
-              <w:jc w:val="left"/>
-            </w:pPr>
-            <w:r>
-              <w:rPr>
-                <w:sz w:val="24"/>
-              </w:rPr>
-              <w:t xml:space="preserve">- Sáu nhóm yếu tố ảnh hưởng: thể chế, tổ chức bộ máy, tài chính, dữ liệu, con người, động lực và văn hóa.</w:t>
-            </w:r>
-          </w:p>
-        </w:tc>
-      </w:tr>
-      <w:tr>
-        <w:trPr/>
-        <w:tc>
-          <w:tcPr>
-            <w:tcW w:w="2418" w:type="dxa"/>
-            <w:vAlign w:val="center"/>
-          </w:tcPr>
-          <w:p>
-            <w:pPr>
-              <w:spacing w:before="20" w:after="20" w:line="252" w:lineRule="auto"/>
-              <w:ind w:firstLine="0"/>
-              <w:jc w:val="left"/>
-            </w:pPr>
-            <w:r>
-              <w:rPr>
-                <w:sz w:val="24"/>
-              </w:rPr>
-              <w:t xml:space="preserve">3. Thực trạng tại Trường Đại học Thành Đô, Chương 2</w:t>
-            </w:r>
-          </w:p>
-        </w:tc>
-        <w:tc>
-          <w:tcPr>
-            <w:tcW w:w="6651" w:type="dxa"/>
-            <w:vAlign w:val="center"/>
-          </w:tcPr>
-          <w:p>
-            <w:pPr>
-              <w:spacing w:before="20" w:after="20" w:line="252" w:lineRule="auto"/>
-              <w:ind w:firstLine="0"/>
-              <w:jc w:val="left"/>
-            </w:pPr>
-            <w:r>
-              <w:rPr>
-                <w:sz w:val="24"/>
-              </w:rPr>
-              <w:t xml:space="preserve">- Nguồn hình thành tài sản: 582 bản ghi sản phẩm khoa học, 38 đề tài cấp cơ sở, 12 tài sản trí tuệ giai đoạn 2021 - 2025.</w:t>
-            </w:r>
-          </w:p>
-          <w:p>
-            <w:pPr>
-              <w:spacing w:before="20" w:after="20" w:line="252" w:lineRule="auto"/>
-              <w:ind w:firstLine="0"/>
-              <w:jc w:val="left"/>
-            </w:pPr>
-            <w:r>
-              <w:rPr>
-                <w:sz w:val="24"/>
-              </w:rPr>
-              <w:t xml:space="preserve">- Thể chế, tổ chức và nguồn lực: Quyết định số 213/QĐ-ĐHTĐ, Quyết định số 217/QĐ-ĐHTĐ, Quy chế chi tiêu nội bộ, Kế hoạch số 07/KH-ĐHTĐ; bộ máy, kinh phí, cơ chế khuyến khích, dữ liệu.</w:t>
-            </w:r>
-          </w:p>
-          <w:p>
-            <w:pPr>
-              <w:spacing w:before="20" w:after="20" w:line="252" w:lineRule="auto"/>
-              <w:ind w:firstLine="0"/>
-              <w:jc w:val="left"/>
-            </w:pPr>
-            <w:r>
-              <w:rPr>
-                <w:sz w:val="24"/>
-              </w:rPr>
-              <w:t xml:space="preserve">- Chuỗi chuyển hóa từ đề tài sang đơn đăng ký và mức độ khai thác.</w:t>
-            </w:r>
-          </w:p>
-          <w:p>
-            <w:pPr>
-              <w:spacing w:before="20" w:after="20" w:line="252" w:lineRule="auto"/>
-              <w:ind w:firstLine="0"/>
-              <w:jc w:val="left"/>
-            </w:pPr>
-            <w:r>
-              <w:rPr>
-                <w:sz w:val="24"/>
-              </w:rPr>
-              <w:t xml:space="preserve">- Đánh giá tổng hợp: kết quả, hạn chế, nguyên nhân khách quan và chủ quan.</w:t>
-            </w:r>
-          </w:p>
-        </w:tc>
-      </w:tr>
-      <w:tr>
-        <w:trPr/>
-        <w:tc>
-          <w:tcPr>
-            <w:tcW w:w="2418" w:type="dxa"/>
-            <w:vAlign w:val="center"/>
-          </w:tcPr>
-          <w:p>
-            <w:pPr>
-              <w:spacing w:before="20" w:after="20" w:line="252" w:lineRule="auto"/>
-              <w:ind w:firstLine="0"/>
-              <w:jc w:val="left"/>
-            </w:pPr>
-            <w:r>
-              <w:rPr>
-                <w:sz w:val="24"/>
-              </w:rPr>
-              <w:t xml:space="preserve">4. Hệ thống giải pháp, Chương 3</w:t>
-            </w:r>
-          </w:p>
-        </w:tc>
-        <w:tc>
-          <w:tcPr>
-            <w:tcW w:w="6651" w:type="dxa"/>
-            <w:vAlign w:val="center"/>
-          </w:tcPr>
-          <w:p>
-            <w:pPr>
-              <w:spacing w:before="20" w:after="20" w:line="252" w:lineRule="auto"/>
-              <w:ind w:firstLine="0"/>
-              <w:jc w:val="left"/>
-            </w:pPr>
-            <w:r>
-              <w:rPr>
-                <w:sz w:val="24"/>
-              </w:rPr>
-              <w:t xml:space="preserve">- Phân tích điểm mạnh, điểm yếu, thời cơ, thách thức và năm nguyên tắc xây dựng giải pháp.</w:t>
-            </w:r>
-          </w:p>
-          <w:p>
-            <w:pPr>
-              <w:spacing w:before="20" w:after="20" w:line="252" w:lineRule="auto"/>
-              <w:ind w:firstLine="0"/>
-              <w:jc w:val="left"/>
-            </w:pPr>
-            <w:r>
-              <w:rPr>
-                <w:sz w:val="24"/>
-              </w:rPr>
-              <w:t xml:space="preserve">- Năm nhóm giải pháp: thể chế, bộ máy, quy trình 8 khâu, tài chính, đào tạo và văn hóa.</w:t>
-            </w:r>
-          </w:p>
-          <w:p>
-            <w:pPr>
-              <w:spacing w:before="20" w:after="20" w:line="252" w:lineRule="auto"/>
-              <w:ind w:firstLine="0"/>
-              <w:jc w:val="left"/>
-            </w:pPr>
-            <w:r>
-              <w:rPr>
-                <w:sz w:val="24"/>
-              </w:rPr>
-              <w:t xml:space="preserve">- Mô-đun Không gian sáng tạo mở thử nghiệm trong quy trình 8 khâu, gắn với cam kết bảo mật và giữ ngày ưu tiên.</w:t>
-            </w:r>
-          </w:p>
-          <w:p>
-            <w:pPr>
-              <w:spacing w:before="20" w:after="20" w:line="252" w:lineRule="auto"/>
-              <w:ind w:firstLine="0"/>
-              <w:jc w:val="left"/>
-            </w:pPr>
-            <w:r>
-              <w:rPr>
-                <w:sz w:val="24"/>
-              </w:rPr>
-              <w:t xml:space="preserve">- Thí điểm rà soát tại Viện Y - Dược, lộ trình triển khai và bộ chỉ số theo dõi.</w:t>
-            </w:r>
-          </w:p>
-        </w:tc>
-      </w:tr>
-    </w:tbl>
+        <w:rPr>
+          <w:szCs w:val="26"/>
+        </w:rPr>
+      </w:pPr>
+      <w:r>
+        <w:drawing>
+          <wp:inline xmlns:a="http://schemas.openxmlformats.org/drawingml/2006/main" xmlns:pic="http://schemas.openxmlformats.org/drawingml/2006/picture">
+            <wp:extent cx="5580000" cy="4896000"/>
+            <wp:docPr id="3" name="Picture 3"/>
+            <wp:cNvGraphicFramePr>
+              <a:graphicFrameLocks noChangeAspect="1"/>
+            </wp:cNvGraphicFramePr>
+            <a:graphic>
+              <a:graphicData uri="http://schemas.openxmlformats.org/drawingml/2006/picture">
+                <pic:pic>
+                  <pic:nvPicPr>
+                    <pic:cNvPr id="0" name="khung_phan_tich.png"/>
+                    <pic:cNvPicPr/>
+                  </pic:nvPicPr>
+                  <pic:blipFill>
+                    <a:blip r:embed="rId10"/>
+                    <a:stretch>
+                      <a:fillRect/>
+                    </a:stretch>
+                  </pic:blipFill>
+                  <pic:spPr>
+                    <a:xfrm>
+                      <a:off x="0" y="0"/>
+                      <a:ext cx="5580000" cy="4896000"/>
+                    </a:xfrm>
+                    <a:prstGeom prst="rect"/>
+                  </pic:spPr>
+                </pic:pic>
+              </a:graphicData>
+            </a:graphic>
+          </wp:inline>
+        </w:drawing>
+      </w:r>
+    </w:p>
     <w:p>
       <w:pPr>
         <w:spacing w:after="160"/>
@@ -3567,7 +3060,7 @@
         <w:rPr>
           <w:szCs w:val="26"/>
         </w:rPr>
-        <w:t xml:space="preserve">, cập nhật hệ thống pháp luật quốc gia hiện hành, làm rõ quyền đăng ký theo điểm c khoản 1 Điều 86 Luật Sở hữu trí tuệ do Luật số 131/2025/QH15 bổ sung; phân tích việc Luật số 93/2025/QH15 bãi bỏ Điều 86a, Điều 133a và khoản 2 Điều 135 Luật Sở hữu trí tuệ, theo đó pháp luật không còn đặt trần thù lao, trao toàn quyền tự chủ thỏa thuận cho cơ sở giáo dục đại học, qua đó khẳng định rào cản thù lao hiện nay hoàn toàn nằm ở quy chế nội bộ của Nhà trường và cung cấp căn cứ pháp lý vững chắc để đề xuất sửa đổi ở Chương 3.</w:t>
+        <w:t xml:space="preserve">, cập nhật hệ thống pháp luật quốc gia hiện hành, làm rõ cơ chế tự động giao quyền sở hữu kết quả nghiên cứu tại Điều 25 và mức thưởng tối thiểu 30% cho tác giả kết quả sử dụng ngân sách nhà nước tại Điều 28 Luật số 93/2025/QH15, quyền đăng ký theo điểm c khoản 1 Điều 86 Luật Sở hữu trí tuệ do Luật số 131/2025/QH15 bổ sung; phân tích việc Luật số 93/2025/QH15 bãi bỏ Điều 86a, Điều 133a và khoản 2 Điều 135 Luật Sở hữu trí tuệ, theo đó pháp luật không còn đặt trần thù lao, trao toàn quyền tự chủ thỏa thuận cho cơ sở giáo dục đại học, qua đó khẳng định rào cản thù lao hiện nay hoàn toàn nằm ở quy chế nội bộ của Nhà trường và cung cấp căn cứ pháp lý vững chắc để đề xuất sửa đổi ở Chương 3.</w:t>
       </w:r>
     </w:p>
     <w:p>

</xml_diff>